<commit_message>
docs: describe electron isolation as default behaviour in the comparison
Co-Authored-By: Claude Fable 5.1 <noreply@anthropic.com>
</commit_message>
<xml_diff>
--- a/docs/reports/stage4-comparison.docx
+++ b/docs/reports/stage4-comparison.docx
@@ -2245,58 +2245,26 @@
               <w:rPr>
                 <w:lang w:val="uk"/>
               </w:rPr>
-              <w:t xml:space="preserve">Ізоляція процесів Electron (</w:t>
+              <w:t xml:space="preserve">Типова ізоляція процесів Electron (контекстна ізоляція та вимкнена інтеграція Node у рендерері за замовчуванням) і звужений</w:t>
+            </w:r>
+            <w:r>
+              <w:rPr>
+                <w:lang w:val="uk"/>
+              </w:rPr>
+              <w:t xml:space="preserve"> </w:t>
             </w:r>
             <w:r>
               <w:rPr>
                 <w:rStyle w:val="VerbatimChar"/>
                 <w:lang w:val="uk"/>
               </w:rPr>
-              <w:t xml:space="preserve">contextIsolation</w:t>
-            </w:r>
-            <w:r>
-              <w:rPr>
-                <w:lang w:val="uk"/>
-              </w:rPr>
-              <w:t xml:space="preserve">,</w:t>
-            </w:r>
-            <w:r>
-              <w:rPr>
-                <w:lang w:val="uk"/>
-              </w:rPr>
-              <w:t xml:space="preserve"> </w:t>
-            </w:r>
-            <w:r>
-              <w:rPr>
-                <w:rStyle w:val="VerbatimChar"/>
-                <w:lang w:val="uk"/>
-              </w:rPr>
-              <w:t xml:space="preserve">nodeIntegration: false</w:t>
-            </w:r>
-            <w:r>
-              <w:rPr>
-                <w:lang w:val="uk"/>
-              </w:rPr>
-              <w:t xml:space="preserve">, звужений</w:t>
-            </w:r>
-            <w:r>
-              <w:rPr>
-                <w:lang w:val="uk"/>
-              </w:rPr>
-              <w:t xml:space="preserve"> </w:t>
-            </w:r>
-            <w:r>
-              <w:rPr>
-                <w:rStyle w:val="VerbatimChar"/>
-                <w:lang w:val="uk"/>
-              </w:rPr>
               <w:t xml:space="preserve">PreloadBridge</w:t>
             </w:r>
             <w:r>
               <w:rPr>
                 <w:lang w:val="uk"/>
               </w:rPr>
-              <w:t xml:space="preserve">), локальний доступ до файлів обмежено</w:t>
+              <w:t xml:space="preserve">, локальний доступ до файлів обмежено</w:t>
             </w:r>
             <w:r>
               <w:rPr>

</xml_diff>